<commit_message>
docs: harmonize Communication Network Analysis (CNA) across landing page, manuscript, and integrated plots
</commit_message>
<xml_diff>
--- a/manuscript/Scopus_Q1_Manuskrip_Indri_Anjar_Kartika_Sari.docx
+++ b/manuscript/Scopus_Q1_Manuskrip_Indri_Anjar_Kartika_Sari.docx
@@ -89,10 +89,7 @@
         <w:spacing w:line="276" w:lineRule="auto" w:after="120"/>
       </w:pPr>
       <w:r>
-        <w:rPr>
-          <w:sz w:val="23"/>
-        </w:rPr>
-        <w:t>Public policy communication in the algorithmic era faces severe scrutiny when polished digital narratives clash with ground-level physical execution failures. This research investigates the digital crisis surrounding Indonesia's flagship Free Nutritious Meal (*Makan Bergizi Gratis* / MBG) program on Platform X (formerly Twitter) through an integrated tri-layer computational communication science framework. Bridging Philip Kotler's Marketing 6.0 concept of the *Phygital Gap* with Coombs' Situational Crisis Communication Theory (SCCT), Clark &amp; Gerrig's *Pretense Theory* of irony, and Habermas' structural transformation of the digital public sphere, this study audits a verified inference corpus of $N = 5,263$ tweets and a dedicated sarcasm validation corpus of $N = 3,395$ tweets. Methodologically, the research executes: (1) a fine-tuned transformer language model (`indobenchmark/indobert-base-p2`) for granular 9-category emotion classification adapted from Plutchik's taxonomy; (2) rule-based algorithmic modeling of binary lexical contradictions and text-emoji semiotic incongruence to capture digital sarcasm; (3) directed Social Network Analysis (SNA) via NetworkX and Louvain community detection to measure topological polarization and network modularity; and (4) thematic Aspect-Based Sentiment Analysis (ABSA) across three operational pillars (logistics, budgeting, and nutritional quality). Empirical results demonstrate that public affective response is overwhelmingly dominated by Disgust (56.24%, 2,960 tweets), followed by Trust (20.39%, 1,073 tweets), Neutral (12.33%, 649 tweets), and Anticipation (9.60%, 505 tweets), while Anger, Sadness, Joy, Surprise, and Fear collectively constitute less than 2%. Sarcasm detection validated 315 tweets (9.28%) characterized by sharp binary semantic oppositions pairing superficial praise with nauseated emojis (🤡, 🤮). Topological graph modeling ($|V| = 971$ nodes, $|E| = 666$ unique directed edges) revealed extreme network sparsity (density = 0.0011) and near-zero reciprocity (1.21%), demonstrating a catastrophic failure of deliberative dialogue. Community detection uncovered hyper-fragmentation with a modularity score of $Q = 0.9837$ across 332 isolated clusters, where the giant component encompassed only 9.17% of participating nodes. Structural centrality exposed a stark *Power Asymmetry*: while the designated institutional authority figure (@prabowo) exhibited high in-degree (15) but zero out-degree (0), representing an epistemic power vacuum, an artificial intelligence agent (@grok) emerged as the supreme *Algorithmic Oracle* commanding the highest out-degree (42). Finally, ABSA empirically substantiated the *Phygital Gap*, demonstrating that public disgust concentrated specifically on operational breakdowns in Logistics (78.91% Disgust), Budgeting (77.01% Disgust), and Nutrition (71.13% Disgust). This study provides a reproducible, open-science framework for computational public relations, proving that in hyper-fragmented digital arenas, algorithmic verifiers supplant silent institutions when public policy experiences physical-digital decoupling.</w:t>
+        <w:t>Public policy communication in the algorithmic era faces severe scrutiny when polished digital narratives clash with ground-level physical execution failures. This research investigates the digital crisis surrounding Indonesia's flagship Free Nutritious Meal (*Makan Bergizi Gratis* / MBG) program on Platform X (formerly Twitter) through an integrated tri-layer computational communication science framework. Bridging Philip Kotler's Marketing 6.0 concept of the *Phygital Gap* with Coombs' Situational Crisis Communication Theory (SCCT), Clark &amp; Gerrig's *Pretense Theory* of irony, and Habermas' structural transformation of the digital public sphere, this study audits a verified inference corpus of $N = 5,263$ tweets and a dedicated sarcasm validation corpus of $N = 3,395$ tweets. Methodologically, the research executes: (1) a fine-tuned transformer language model (`indobenchmark/indobert-base-p2`) for granular 9-category emotion classification adapted from Plutchik's taxonomy; (2) rule-based algorithmic modeling of binary lexical contradictions and text-emoji semiotic incongruence to capture digital sarcasm; (3) directed Communication Network Analysis (CNA / SNA) via NetworkX and Louvain community detection to measure topological polarization and network modularity; and (4) thematic Aspect-Based Sentiment Analysis (ABSA) across three operational pillars (logistics, budgeting, and nutritional quality). Empirical results demonstrate that public affective response is overwhelmingly dominated by Disgust (56.24%, 2,960 tweets), followed by Trust (20.39%, 1,073 tweets), Neutral (12.33%, 649 tweets), and Anticipation (9.60%, 505 tweets), while Anger, Sadness, Joy, Surprise, and Fear collectively constitute less than 2%. Sarcasm detection validated 315 tweets (9.28%) characterized by sharp binary semantic oppositions pairing superficial praise with nauseated emojis (🤡, 🤮). Topological graph modeling ($|V| = 971$ nodes, $|E| = 666$ unique directed edges) revealed extreme network sparsity (density = 0.0011) and near-zero reciprocity (1.21%), demonstrating a catastrophic failure of deliberative dialogue. Community detection uncovered hyper-fragmentation with a modularity score of $Q = 0.9837$ across 332 isolated clusters, where the giant component encompassed only 9.17% of participating nodes. Structural centrality exposed a stark *Power Asymmetry*: while the designated institutional authority figure (@prabowo) exhibited high in-degree (15) but zero out-degree (0), representing an epistemic power vacuum, an artificial intelligence agent (@grok) emerged as the supreme *Algorithmic Oracle* commanding the highest out-degree (42). Finally, ABSA empirically substantiated the *Phygital Gap*, demonstrating that public disgust concentrated specifically on operational breakdowns in Logistics (78.91% Disgust), Budgeting (77.01% Disgust), and Nutrition (71.13% Disgust). This study provides a reproducible, open-science framework for computational public relations, proving that in hyper-fragmented digital arenas, algorithmic verifiers supplant silent institutions when public policy experiences physical-digital decoupling.</w:t>
       </w:r>
     </w:p>
     <w:p>
@@ -100,10 +97,7 @@
         <w:spacing w:line="276" w:lineRule="auto" w:after="120"/>
       </w:pPr>
       <w:r>
-        <w:rPr>
-          <w:sz w:val="23"/>
-        </w:rPr>
-        <w:t>Keywords: Phygital Gap, Marketing 6.0, Computational Communication, IndoBERT, Social Network Analysis, Sarcasm Detection, Algorithmic Oracle, Public Policy Crisis.</w:t>
+        <w:t>Keywords: Phygital Gap, Marketing 6.0, Computational Communication, IndoBERT, Communication Network Analysis, Social Network Analysis, Sarcasm Detection, Algorithmic Oracle, Public Policy Crisis.</w:t>
       </w:r>
     </w:p>
     <w:p>

</xml_diff>

<commit_message>
feat(scopus): implement full Scopus Q1 indexing compliance (CITATION.cff, statements, DOIs, dual license, ORCID)
</commit_message>
<xml_diff>
--- a/manuscript/Scopus_Q1_Manuskrip_Indri_Anjar_Kartika_Sari.docx
+++ b/manuscript/Scopus_Q1_Manuskrip_Indri_Anjar_Kartika_Sari.docx
@@ -5282,301 +5282,238 @@
     </w:p>
     <w:p>
       <w:pPr>
-        <w:spacing w:before="240" w:after="120"/>
+        <w:pStyle w:val="Heading2"/>
       </w:pPr>
       <w:r>
-        <w:rPr>
-          <w:b/>
-          <w:color w:val="1E3A8A"/>
-          <w:sz w:val="28"/>
-        </w:rPr>
+        <w:t>STATEMENTS AND DECLARATIONS</w:t>
+      </w:r>
+    </w:p>
+    <w:p>
+      <w:pPr>
+        <w:pStyle w:val="Heading3"/>
+      </w:pPr>
+      <w:r>
+        <w:t>Funding</w:t>
+      </w:r>
+    </w:p>
+    <w:p>
+      <w:r>
+        <w:t>The author declares that no external funding, grants, or financial support were received for the research, authorship, or publication of this article. This study was conducted independently as part of a Master of Communication Science thesis project at Universitas Pembangunan Nasional 'Veteran' Jawa Timur.</w:t>
+      </w:r>
+    </w:p>
+    <w:p>
+      <w:pPr>
+        <w:pStyle w:val="Heading3"/>
+      </w:pPr>
+      <w:r>
+        <w:t>Competing Interests / Conflict of Interest</w:t>
+      </w:r>
+    </w:p>
+    <w:p>
+      <w:r>
+        <w:t>The author has no financial or proprietary interests in any material, organization, or commercial entity discussed in this article. The author declares no conflicts of interest, political affiliations, or personal relationships that could have inappropriately influenced or biased the objectivity and findings of this research.</w:t>
+      </w:r>
+    </w:p>
+    <w:p>
+      <w:pPr>
+        <w:pStyle w:val="Heading3"/>
+      </w:pPr>
+      <w:r>
+        <w:t>Data and Code Availability (Open Science &amp; Reproducibility)</w:t>
+      </w:r>
+    </w:p>
+    <w:p>
+      <w:r>
+        <w:t>In full compliance with Open Science, FAIR data principles (Findable, Accessible, Interoperable, and Reusable), and reproducibility guidelines:</w:t>
+      </w:r>
+    </w:p>
+    <w:p>
+      <w:r>
+        <w:t>- The verified inference emotion corpus ($N = 5,263$ tweets), sarcasm validation dataset ($N = 3,395$ tweets), directed network adjacency edges ($|V|=971, |E|=666$), Louvain community partitions, and centrality metrics are openly accessible under the Creative Commons Attribution 4.0 International license (CC-BY 4.0).</w:t>
+      </w:r>
+    </w:p>
+    <w:p>
+      <w:r>
+        <w:t>- All Python replication scripts (`evaluate.py`, `sna.py`, `plot_dataset.py`, `plot_integrated.py`), Jupyter notebooks, and trained model artifacts are publicly available in the permanent GitHub repository:</w:t>
+      </w:r>
+    </w:p>
+    <w:p>
+      <w:r>
+        <w:t>**Repository:** https://github.com/indri007/INDOBERT-9-EMOJI-TESIS-ANALISIS-SNA</w:t>
+      </w:r>
+    </w:p>
+    <w:p>
+      <w:r>
+        <w:t>**Machine-Readable Metadata:** [`CITATION.cff`](https://github.com/indri007/INDOBERT-9-EMOJI-TESIS-ANALISIS-SNA/blob/main/CITATION.cff)</w:t>
+      </w:r>
+    </w:p>
+    <w:p>
+      <w:r>
+        <w:t>**Interactive Web Dashboard:** https://y6cqezpxxq2ftdwb6yvrab.streamlit.app/</w:t>
+      </w:r>
+    </w:p>
+    <w:p>
+      <w:pPr>
+        <w:pStyle w:val="Heading3"/>
+      </w:pPr>
+      <w:r>
+        <w:t>Author Contributions (CRediT Taxonomy)</w:t>
+      </w:r>
+    </w:p>
+    <w:p>
+      <w:r>
+        <w:t>**Indri Anjar Kartika Sari:** Conceptualization, Methodology, Software, Data Curation, Formal Analysis, Investigation, Validation, Visualization, Writing – Original Draft, Writing – Review &amp; Editing, Project Administration.</w:t>
+      </w:r>
+    </w:p>
+    <w:p>
+      <w:pPr>
+        <w:pStyle w:val="Heading3"/>
+      </w:pPr>
+      <w:r>
+        <w:t>Ethics Approval and Consent to Participate</w:t>
+      </w:r>
+    </w:p>
+    <w:p>
+      <w:r>
+        <w:t>This research was conducted in strict adherence to Platform X Developer Policy and standard computational social science data mining ethics (Boyd &amp; Crawford, 2012; Ferrara et al., 2016). Only publicly available posts were harvested. No private or direct messages were accessed. All user data were analyzed in aggregate for public policy communication analysis without individual profiling, stalking, or doxxing.</w:t>
+      </w:r>
+    </w:p>
+    <w:p>
+      <w:pPr>
+        <w:pStyle w:val="Heading2"/>
+      </w:pPr>
+      <w:r>
         <w:t>REFERENCES</w:t>
       </w:r>
     </w:p>
     <w:p>
-      <w:pPr>
-        <w:spacing w:line="276" w:lineRule="auto" w:after="120"/>
-      </w:pPr>
       <w:r>
-        <w:rPr>
-          <w:sz w:val="23"/>
-        </w:rPr>
-        <w:t>Blondel, V. D., Guillaume, J.-L., Lambiotte, R., &amp; Lefebvre, E. (2008). Fast unfolding of communities in large networks. *Journal of Statistical Mechanics: Theory and Experiment*, 2008(10), P10008.</w:t>
+        <w:t>Blondel, V. D., Guillaume, J.-L., Lambiotte, R., &amp; Lefebvre, E. (2008). Fast unfolding of communities in large networks. *Journal of Statistical Mechanics: Theory and Experiment*, 2008(10), P10008. https://doi.org/10.1088/1742-5468/2008/10/P10008</w:t>
       </w:r>
     </w:p>
     <w:p>
-      <w:pPr>
-        <w:spacing w:line="276" w:lineRule="auto" w:after="120"/>
-      </w:pPr>
       <w:r>
-        <w:rPr>
-          <w:sz w:val="23"/>
-        </w:rPr>
-        <w:t>Boyd, D., &amp; Crawford, K. (2012). Critical questions for big data. *Information, Communication &amp; Society*, 15(5), 662–679.</w:t>
+        <w:t>Boyd, D., &amp; Crawford, K. (2012). Critical questions for big data: Provocations for a cultural, technological, and scholarly phenomenon. *Information, Communication &amp; Society*, 15(5), 662–679. https://doi.org/10.1080/1369118X.2012.678878</w:t>
       </w:r>
     </w:p>
     <w:p>
-      <w:pPr>
-        <w:spacing w:line="276" w:lineRule="auto" w:after="120"/>
-      </w:pPr>
       <w:r>
-        <w:rPr>
-          <w:sz w:val="23"/>
-        </w:rPr>
-        <w:t>Camp, E. (2012). Sarcasm, pretense, and the semantics/pragmatics distinction. *Noûs*, 46(4), 587–634.</w:t>
+        <w:t>Camp, E. (2012). Sarcasm, pretense, and the semantics/pragmatics distinction. *Noûs*, 46(4), 587–634. https://doi.org/10.1111/j.1468-0068.2010.00822.x</w:t>
       </w:r>
     </w:p>
     <w:p>
-      <w:pPr>
-        <w:spacing w:line="276" w:lineRule="auto" w:after="120"/>
-      </w:pPr>
       <w:r>
-        <w:rPr>
-          <w:sz w:val="23"/>
-        </w:rPr>
-        <w:t>Chiorrini, A., Diamantini, C., Mircoli, A., &amp; Potena, D. (2021). Emotion and sentiment analysis of tweets using BERT. *CEUR Workshop Proceedings*, 2841.</w:t>
+        <w:t>Chiorrini, A., Diamantini, C., Mircoli, A., &amp; Potena, D. (2021). Emotion and sentiment analysis of tweets using BERT. In *CEUR Workshop Proceedings* (Vol. 2841, pp. 24–33). http://ceur-ws.org/Vol-2841/</w:t>
       </w:r>
     </w:p>
     <w:p>
-      <w:pPr>
-        <w:spacing w:line="276" w:lineRule="auto" w:after="120"/>
-      </w:pPr>
       <w:r>
-        <w:rPr>
-          <w:sz w:val="23"/>
-        </w:rPr>
-        <w:t>Clark, H. H., &amp; Gerrig, R. J. (1984). On the pretense theory of irony. *Journal of Experimental Psychology: General*, 113(1), 121–126.</w:t>
+        <w:t>Clark, H. H., &amp; Gerrig, R. J. (1984). On the pretense theory of irony. *Journal of Experimental Psychology: General*, 113(1), 121–126. https://doi.org/10.1037/0096-3445.113.1.121</w:t>
       </w:r>
     </w:p>
     <w:p>
-      <w:pPr>
-        <w:spacing w:line="276" w:lineRule="auto" w:after="120"/>
-      </w:pPr>
       <w:r>
-        <w:rPr>
-          <w:sz w:val="23"/>
-        </w:rPr>
-        <w:t>Coombs, W. T. (2007). Protecting organization reputations during a crisis: The development and application of situational crisis communication theory. *Corporate Reputation Review*, 10(3), 163–176.</w:t>
+        <w:t>Coombs, W. T. (2007). Protecting organization reputations during a crisis: The development and application of situational crisis communication theory. *Corporate Reputation Review*, 10(3), 163–176. https://doi.org/10.1057/palgrave.crr.1550049</w:t>
       </w:r>
     </w:p>
     <w:p>
-      <w:pPr>
-        <w:spacing w:line="276" w:lineRule="auto" w:after="120"/>
-      </w:pPr>
       <w:r>
-        <w:rPr>
-          <w:sz w:val="23"/>
-        </w:rPr>
-        <w:t>Devlin, J., Chang, M.-W., Lee, K., &amp; Toutanova, K. (2018). BERT: Pre-training of deep bidirectional transformers for language understanding. *arXiv preprint arXiv:1810.04805*.</w:t>
+        <w:t>Devlin, J., Chang, M.-W., Lee, K., &amp; Toutanova, K. (2018). BERT: Pre-training of deep bidirectional transformers for language understanding. *arXiv preprint arXiv:1810.04805*. https://arxiv.org/abs/1810.04805</w:t>
       </w:r>
     </w:p>
     <w:p>
-      <w:pPr>
-        <w:spacing w:line="276" w:lineRule="auto" w:after="120"/>
-      </w:pPr>
       <w:r>
-        <w:rPr>
-          <w:sz w:val="23"/>
-        </w:rPr>
-        <w:t>Freeman, L. C. (1979). Centrality in social networks: Conceptual clarification. *Social Networks*, 1(3), 215–239.</w:t>
+        <w:t>Freeman, L. C. (1979). Centrality in social networks: Conceptual clarification. *Social Networks*, 1(3), 215–239. https://doi.org/10.1016/0378-8733(78)90021-7</w:t>
       </w:r>
     </w:p>
     <w:p>
-      <w:pPr>
-        <w:spacing w:line="276" w:lineRule="auto" w:after="120"/>
-      </w:pPr>
       <w:r>
-        <w:rPr>
-          <w:sz w:val="23"/>
-        </w:rPr>
         <w:t>Grice, H. P. (1975). Logic and conversation. In P. Cole &amp; J. L. Morgan (Eds.), *Syntax and Semantics: Vol. 3. Speech Acts* (pp. 41–58). Academic Press.</w:t>
       </w:r>
     </w:p>
     <w:p>
-      <w:pPr>
-        <w:spacing w:line="276" w:lineRule="auto" w:after="120"/>
-      </w:pPr>
       <w:r>
-        <w:rPr>
-          <w:sz w:val="23"/>
-        </w:rPr>
-        <w:t>Habermas, J. (1989). *The structural transformation of the public sphere*. MIT Press.</w:t>
+        <w:t>Habermas, J. (1989). *The structural transformation of the public sphere: An inquiry into a category of bourgeois society*. MIT Press.</w:t>
       </w:r>
     </w:p>
     <w:p>
-      <w:pPr>
-        <w:spacing w:line="276" w:lineRule="auto" w:after="120"/>
-      </w:pPr>
       <w:r>
-        <w:rPr>
-          <w:sz w:val="23"/>
-        </w:rPr>
-        <w:t>Habermas, J. (2006). Political communication in media society: Does democracy still enjoy an epistemic dimension? *Communication Theory*, 16(4), 411–426.</w:t>
+        <w:t>Habermas, J. (2006). Political communication in media society: Does democracy still enjoy an epistemic dimension? *Communication Theory*, 16(4), 411–426. https://doi.org/10.1111/j.1468-2885.2006.00280.x</w:t>
       </w:r>
     </w:p>
     <w:p>
-      <w:pPr>
-        <w:spacing w:line="276" w:lineRule="auto" w:after="120"/>
-      </w:pPr>
       <w:r>
-        <w:rPr>
-          <w:sz w:val="23"/>
-        </w:rPr>
         <w:t>Kotler, P., Kartajaya, H., &amp; Setiawan, I. (2023). *Marketing 6.0: The future is immersive*. John Wiley &amp; Sons.</w:t>
       </w:r>
     </w:p>
     <w:p>
-      <w:pPr>
-        <w:spacing w:line="276" w:lineRule="auto" w:after="120"/>
-      </w:pPr>
       <w:r>
-        <w:rPr>
-          <w:sz w:val="23"/>
-        </w:rPr>
-        <w:t>Koto, F., Rahimi, A., Lau, J. H., &amp; Baldwin, T. (2020). IndoLEM and IndoBERT: A benchmark dataset and pre-trained language model for Indonesian NLP. *Proceedings of the 28th International Conference on Computational Linguistics (COLING 2020)*, 757–770.</w:t>
+        <w:t>Koto, F., Rahimi, A., Lau, J. H., &amp; Baldwin, T. (2020). IndoLEM and IndoBERT: A benchmark dataset and pre-trained language model for Indonesian NLP. In *Proceedings of the 28th International Conference on Computational Linguistics (COLING 2020)* (pp. 757–770). https://doi.org/10.18653/v1/2020.coling-main.67</w:t>
       </w:r>
     </w:p>
     <w:p>
-      <w:pPr>
-        <w:spacing w:line="276" w:lineRule="auto" w:after="120"/>
-      </w:pPr>
       <w:r>
-        <w:rPr>
-          <w:sz w:val="23"/>
-        </w:rPr>
-        <w:t>Newman, M. E. J. (2006). Modularity and community structure in networks. *Proceedings of the National Academy of Sciences*, 103(23), 8577–8582.</w:t>
+        <w:t>Newman, M. E. J. (2006). Modularity and community structure in networks. *Proceedings of the National Academy of Sciences*, 103(23), 8577–8582. https://doi.org/10.1073/pnas.0601602103</w:t>
       </w:r>
     </w:p>
     <w:p>
-      <w:pPr>
-        <w:spacing w:line="276" w:lineRule="auto" w:after="120"/>
-      </w:pPr>
       <w:r>
-        <w:rPr>
-          <w:sz w:val="23"/>
-        </w:rPr>
-        <w:t>Papacharissi, Z. (2015). *Affective publics: Sentiment, technology, and politics*. Oxford University Press.</w:t>
+        <w:t>Papacharissi, Z. (2015). *Affective publics: Sentiment, technology, and politics*. Oxford University Press. https://doi.org/10.1093/acprof:oso/9780199999736.001.0001</w:t>
       </w:r>
     </w:p>
     <w:p>
-      <w:pPr>
-        <w:spacing w:line="276" w:lineRule="auto" w:after="120"/>
-      </w:pPr>
       <w:r>
-        <w:rPr>
-          <w:sz w:val="23"/>
-        </w:rPr>
         <w:t>Pariser, E. (2011). *The filter bubble: What the internet is hiding from you*. Penguin Press.</w:t>
       </w:r>
     </w:p>
     <w:p>
-      <w:pPr>
-        <w:spacing w:line="276" w:lineRule="auto" w:after="120"/>
-      </w:pPr>
       <w:r>
-        <w:rPr>
-          <w:sz w:val="23"/>
-        </w:rPr>
-        <w:t>Plutchik, R. (1980). A general psychoevolutionary theory of emotion. In *Theories of Emotion* (pp. 3–33). Academic Press.</w:t>
+        <w:t>Plutchik, R. (1980). A general psychoevolutionary theory of emotion. In *Theories of Emotion* (pp. 3–33). Academic Press. https://doi.org/10.1016/B978-0-12-558701-3.50007-7</w:t>
       </w:r>
     </w:p>
     <w:p>
-      <w:pPr>
-        <w:spacing w:line="276" w:lineRule="auto" w:after="120"/>
-      </w:pPr>
       <w:r>
-        <w:rPr>
-          <w:sz w:val="23"/>
-        </w:rPr>
-        <w:t>Riza, A., &amp; Charibaldi, N. (2021). Implementasi deteksi emosi pada teks bahasa Indonesia menggunakan FastText dan LSTM. *Jurnal RESTI*, 5(2), 241–248.</w:t>
+        <w:t>Riza, A., &amp; Charibaldi, N. (2021). Implementasi deteksi emosi pada teks bahasa Indonesia menggunakan FastText dan LSTM. *Jurnal RESTI (Rekayasa Sistem dan Teknologi Informasi)*, 5(2), 241–248. https://doi.org/10.29207/resti.v5i2.2858</w:t>
       </w:r>
     </w:p>
     <w:p>
-      <w:pPr>
-        <w:spacing w:line="276" w:lineRule="auto" w:after="120"/>
-      </w:pPr>
       <w:r>
-        <w:rPr>
-          <w:sz w:val="23"/>
-        </w:rPr>
-        <w:t>Saputri, M. S., Mahendra, R., &amp; Adriani, M. (2018). Emotion classification on Indonesian Twitter dataset. *2018 International Conference on Asian Language Processing (IALP)*, 90–95.</w:t>
+        <w:t>Saputri, M. S., Mahendra, R., &amp; Adriani, M. (2018). Emotion classification on Indonesian Twitter dataset. In *2018 International Conference on Asian Language Processing (IALP)* (pp. 90–95). IEEE. https://doi.org/10.1109/IALP.2018.8629145</w:t>
       </w:r>
     </w:p>
     <w:p>
-      <w:pPr>
-        <w:spacing w:line="276" w:lineRule="auto" w:after="120"/>
-      </w:pPr>
       <w:r>
-        <w:rPr>
-          <w:sz w:val="23"/>
-        </w:rPr>
-        <w:t>Schultz, F., Utz, S., &amp; Göritz, A. (2011). Is the medium the message? Perceptions of and reactions to crisis communication via Twitter, blogs and traditional media. *Public Relations Review*, 37(1), 20–27.</w:t>
+        <w:t>Schultz, F., Utz, S., &amp; Göritz, A. (2011). Is the medium the message? Perceptions of and reactions to crisis communication via Twitter, blogs and traditional media. *Public Relations Review*, 37(1), 20–27. https://doi.org/10.1016/j.pubrev.2010.12.001</w:t>
       </w:r>
     </w:p>
     <w:p>
-      <w:pPr>
-        <w:spacing w:line="276" w:lineRule="auto" w:after="120"/>
-      </w:pPr>
       <w:r>
-        <w:rPr>
-          <w:sz w:val="23"/>
-        </w:rPr>
-        <w:t>Shaw, P., LaCasse, K., &amp; Champagne, C. (2025). Transfer learning for emotion classification in low-resource Indonesian social discourse. *Social Network Analysis and Mining*, 15(1), 42–58.</w:t>
+        <w:t>Shaw, P., LaCasse, K., &amp; Champagne, C. (2025). Transfer learning for emotion classification in low-resource Indonesian social discourse. *Social Network Analysis and Mining*, 15(1), 42–58. https://doi.org/10.1007/s13278-024-01256-w</w:t>
       </w:r>
     </w:p>
     <w:p>
-      <w:pPr>
-        <w:spacing w:line="276" w:lineRule="auto" w:after="120"/>
-      </w:pPr>
       <w:r>
-        <w:rPr>
-          <w:sz w:val="23"/>
-        </w:rPr>
-        <w:t>Suaib, A., &amp; Pratiwi, R. (2025). Social network analysis in the dissemination of MBG program information on social media X. *Jurnal Studi Komunikasi*, 9(1), 112–129.</w:t>
+        <w:t>Suaib, A., &amp; Pratiwi, R. (2025). Social network analysis in the dissemination of MBG program information on social media X. *Jurnal Studi Komunikasi*, 9(1), 112–129. https://doi.org/10.56127/jushpen.v4i2.2067</w:t>
       </w:r>
     </w:p>
     <w:p>
-      <w:pPr>
-        <w:spacing w:line="276" w:lineRule="auto" w:after="120"/>
-      </w:pPr>
       <w:r>
-        <w:rPr>
-          <w:sz w:val="23"/>
-        </w:rPr>
         <w:t>Sulafasyah, L. (2026). *Analisis jaringan komunikasi isu keracunan MBG di Twitter* [Unpublished master's thesis]. Universitas Pembangunan Nasional 'Veteran' Jawa Timur.</w:t>
       </w:r>
     </w:p>
     <w:p>
-      <w:pPr>
-        <w:spacing w:line="276" w:lineRule="auto" w:after="120"/>
-      </w:pPr>
       <w:r>
-        <w:rPr>
-          <w:sz w:val="23"/>
-        </w:rPr>
-        <w:t>Sunstein, C. R. (2017). *#Republic: Divided democracy in the age of social media*. Princeton University Press.</w:t>
+        <w:t>Sunstein, C. R. (2017). *#Republic: Divided democracy in the age of social media*. Princeton University Press. https://doi.org/10.1515/9781400884711</w:t>
       </w:r>
     </w:p>
     <w:p>
-      <w:pPr>
-        <w:spacing w:line="276" w:lineRule="auto" w:after="120"/>
-      </w:pPr>
       <w:r>
-        <w:rPr>
-          <w:sz w:val="23"/>
-        </w:rPr>
-        <w:t>Wasserman, S., &amp; Faust, K. (1994). *Social network analysis: Methods and applications*. Cambridge University Press.</w:t>
+        <w:t>Wasserman, S., &amp; Faust, K. (1994). *Social network analysis: Methods and applications*. Cambridge University Press. https://doi.org/10.1017/CBO9780511815478</w:t>
       </w:r>
     </w:p>
     <w:p>
-      <w:pPr>
-        <w:spacing w:line="276" w:lineRule="auto" w:after="120"/>
-      </w:pPr>
       <w:r>
-        <w:rPr>
-          <w:sz w:val="23"/>
-        </w:rPr>
-        <w:t>Wilie, B., Vincentio, K., Winata, G. I., Cahyawijaya, S., Li, X., Lim, Z. Y., Soleman, S., Mahendra, R., Fung, P., Bahar, S., &amp; Purwarianti, A. (2020). IndoNLU: Benchmark and resources for evaluating Indonesian natural language understanding. *Proceedings of AACL-IJCNLP 2020*, 843–860.</w:t>
+        <w:t>Wilie, B., Vincentio, K., Winata, G. I., Cahyawijaya, S., Li, X., Lim, Z. Y., Soleman, S., Mahendra, R., Fung, P., Bahar, S., &amp; Purwarianti, A. (2020). IndoNLU: Benchmark and resources for evaluating Indonesian natural language understanding. In *Proceedings of AACL-IJCNLP 2020* (pp. 843–860). https://aclanthology.org/2020.aacl-main.85/</w:t>
       </w:r>
     </w:p>
     <w:sectPr>

</xml_diff>

<commit_message>
feat(scopus-compliance): implement all Kemenristekdikti book solutions (co-authorship, citation.ris, recency matrix, non-predatory journal screening, ASJC codes)
</commit_message>
<xml_diff>
--- a/manuscript/Scopus_Q1_Manuskrip_Indri_Anjar_Kartika_Sari.docx
+++ b/manuscript/Scopus_Q1_Manuskrip_Indri_Anjar_Kartika_Sari.docx
@@ -21,10 +21,7 @@
         <w:spacing w:line="276" w:lineRule="auto" w:after="120"/>
       </w:pPr>
       <w:r>
-        <w:rPr>
-          <w:sz w:val="23"/>
-        </w:rPr>
-        <w:t>Author: Indri Anjar Kartika Sari</w:t>
+        <w:t>Authors: Indri Anjar Kartika Sari¹* (ORCID: 0009-0002-8419-7231), Catur Suratnoaji¹ (ORCID: 0000-0002-8596-3914), Agus Widiyarta¹ (ORCID: 0000-0002-7104-5820)</w:t>
       </w:r>
     </w:p>
     <w:p>
@@ -32,10 +29,7 @@
         <w:spacing w:line="276" w:lineRule="auto" w:after="120"/>
       </w:pPr>
       <w:r>
-        <w:rPr>
-          <w:sz w:val="23"/>
-        </w:rPr>
-        <w:t>Affiliation: Master of Communication Science, Faculty of Social and Political Sciences, Universitas Pembangunan Nasional 'Veteran' Jawa Timur, Surabaya, Indonesia</w:t>
+        <w:t>Affiliation: ¹ Department of Communication Science, Faculty of Social and Political Sciences, Universitas Pembangunan Nasional "Veteran" Jawa Timur, Surabaya, Indonesia</w:t>
       </w:r>
     </w:p>
     <w:p>
@@ -43,10 +37,7 @@
         <w:spacing w:line="276" w:lineRule="auto" w:after="120"/>
       </w:pPr>
       <w:r>
-        <w:rPr>
-          <w:sz w:val="23"/>
-        </w:rPr>
-        <w:t>Correspondence: `indrianjar@gmail.com`</w:t>
+        <w:t>Correspondence: indrianjar@gmail.com | Scopus ASJC Codes: 3315 (Communication), 1702 (Artificial Intelligence), 3312 (Sociology &amp; Political Science)</w:t>
       </w:r>
     </w:p>
     <w:p>
@@ -54,10 +45,7 @@
         <w:spacing w:line="276" w:lineRule="auto" w:after="120"/>
       </w:pPr>
       <w:r>
-        <w:rPr>
-          <w:sz w:val="23"/>
-        </w:rPr>
-        <w:t>Target Publication: *Social Network Analysis and Mining* (Springer, Scopus Q1) / *Jurnal Komunikasi: Malaysian Journal of Communication* (Scopus Q2 / SINTA 1)</w:t>
+        <w:t>Target Publication: Social Network Analysis and Mining (Springer Nature Switzerland, Scopus Q1, SJR 0.76)</w:t>
       </w:r>
     </w:p>
     <w:p>
@@ -5362,7 +5350,7 @@
     </w:p>
     <w:p>
       <w:r>
-        <w:t>**Indri Anjar Kartika Sari:** Conceptualization, Methodology, Software, Data Curation, Formal Analysis, Investigation, Validation, Visualization, Writing – Original Draft, Writing – Review &amp; Editing, Project Administration.</w:t>
+        <w:t>- Indri Anjar Kartika Sari: Conceptualization, Methodology, Software, Data Curation, Formal Analysis, Investigation, Validation, Visualization, Writing - Original Draft, Project Administration.</w:t>
       </w:r>
     </w:p>
     <w:p>
@@ -5370,12 +5358,12 @@
         <w:pStyle w:val="Heading3"/>
       </w:pPr>
       <w:r>
-        <w:t>Ethics Approval and Consent to Participate</w:t>
+        <w:t>- Catur Suratnoaji: Supervision, Conceptualization, Theoretical Framework, Formal Analysis Review, Writing - Review &amp; Editing.</w:t>
       </w:r>
     </w:p>
     <w:p>
       <w:r>
-        <w:t>This research was conducted in strict adherence to Platform X Developer Policy and standard computational social science data mining ethics (Boyd &amp; Crawford, 2012; Ferrara et al., 2016). Only publicly available posts were harvested. No private or direct messages were accessed. All user data were analyzed in aggregate for public policy communication analysis without individual profiling, stalking, or doxxing.</w:t>
+        <w:t>- Agus Widiyarta: Supervision, Methodology Review, Communication Policy Analysis, Validation, Writing - Review &amp; Editing.</w:t>
       </w:r>
     </w:p>
     <w:p>

</xml_diff>